<commit_message>
version 0.0.42 missed collectstatic
</commit_message>
<xml_diff>
--- a/staticfiles/facture/file_templates/file_input/Facture_template_Maroc.docx
+++ b/staticfiles/facture/file_templates/file_input/Facture_template_Maroc.docx
@@ -111,10 +111,10 @@
                     <wp:anchor distT="6985" distB="6985" distL="6985" distR="6985" simplePos="0" relativeHeight="251659264" behindDoc="0" locked="0" layoutInCell="0" allowOverlap="1" wp14:anchorId="7B12CB09" wp14:editId="1B04067E">
                       <wp:simplePos x="0" y="0"/>
                       <wp:positionH relativeFrom="column">
-                        <wp:posOffset>8825</wp:posOffset>
+                        <wp:posOffset>8255</wp:posOffset>
                       </wp:positionH>
                       <wp:positionV relativeFrom="paragraph">
-                        <wp:posOffset>79893</wp:posOffset>
+                        <wp:posOffset>29495</wp:posOffset>
                       </wp:positionV>
                       <wp:extent cx="3909527" cy="821094"/>
                       <wp:effectExtent l="0" t="0" r="15240" b="17145"/>
@@ -170,7 +170,7 @@
                 </mc:Choice>
                 <mc:Fallback>
                   <w:pict>
-                    <v:roundrect w14:anchorId="1301AAED" id="Shape 1" o:spid="_x0000_s1026" style="position:absolute;margin-left:.7pt;margin-top:6.3pt;width:307.85pt;height:64.65pt;z-index:251659264;visibility:visible;mso-wrap-style:square;mso-width-percent:0;mso-height-percent:0;mso-wrap-distance-left:.55pt;mso-wrap-distance-top:.55pt;mso-wrap-distance-right:.55pt;mso-wrap-distance-bottom:.55pt;mso-position-horizontal:absolute;mso-position-horizontal-relative:text;mso-position-vertical:absolute;mso-position-vertical-relative:text;mso-width-percent:0;mso-height-percent:0;mso-width-relative:margin;mso-height-relative:margin;v-text-anchor:top" arcsize="10923f" o:gfxdata="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" o:allowincell="f" filled="f" strokeweight=".35mm"/>
+                    <v:roundrect w14:anchorId="472A7D8F" id="Shape 1" o:spid="_x0000_s1026" style="position:absolute;margin-left:.65pt;margin-top:2.3pt;width:307.85pt;height:64.65pt;z-index:251659264;visibility:visible;mso-wrap-style:square;mso-width-percent:0;mso-height-percent:0;mso-wrap-distance-left:.55pt;mso-wrap-distance-top:.55pt;mso-wrap-distance-right:.55pt;mso-wrap-distance-bottom:.55pt;mso-position-horizontal:absolute;mso-position-horizontal-relative:text;mso-position-vertical:absolute;mso-position-vertical-relative:text;mso-width-percent:0;mso-height-percent:0;mso-width-relative:margin;mso-height-relative:margin;v-text-anchor:top" arcsize="10923f" o:gfxdata="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" o:allowincell="f" filled="f" strokeweight=".35mm"/>
                   </w:pict>
                 </mc:Fallback>
               </mc:AlternateContent>
@@ -348,6 +348,15 @@
                       <w:szCs w:val="20"/>
                     </w:rPr>
                   </w:pPr>
+                  <w:proofErr w:type="spellStart"/>
+                  <w:r>
+                    <w:rPr>
+                      <w:rFonts w:ascii="Arial" w:eastAsia="Arial" w:hAnsi="Arial" w:cs="Arial"/>
+                      <w:sz w:val="20"/>
+                      <w:szCs w:val="20"/>
+                    </w:rPr>
+                    <w:t>created_</w:t>
+                  </w:r>
                   <w:r>
                     <w:rPr>
                       <w:rFonts w:ascii="Arial" w:eastAsia="Arial" w:hAnsi="Arial" w:cs="Arial"/>
@@ -356,6 +365,7 @@
                     </w:rPr>
                     <w:t>date</w:t>
                   </w:r>
+                  <w:proofErr w:type="spellEnd"/>
                 </w:p>
               </w:tc>
               <w:tc>

</xml_diff>